<commit_message>
build(docs): publie les trois manuels Word et PDF
</commit_message>
<xml_diff>
--- a/version-finale/03-manuels/D-141-Rafael_Melo-ManuelAnimateur.docx
+++ b/version-finale/03-manuels/D-141-Rafael_Melo-ManuelAnimateur.docx
@@ -4,26 +4,36 @@
   <w:body>
     <w:p>
       <w:pPr>
+        <w:pStyle w:val="Title"/>
         <w:keepNext/>
-        <w:spacing w:after="100"/>
+        <w:spacing w:after="86" w:before="160" w:line="259" w:lineRule="auto"/>
+        <w:jc w:val="left"/>
+        <w:keepLines/>
+        <w:pBdr>
+          <w:bottom w:val="single" w:sz="8" w:space="6" w:color="000000"/>
+        </w:pBdr>
       </w:pPr>
       <w:r>
         <w:rPr>
           <w:rFonts w:ascii="Arial" w:hAnsi="Arial"/>
           <w:b/>
           <w:color w:val="000000"/>
-          <w:sz w:val="42"/>
+          <w:sz w:val="20"/>
         </w:rPr>
         <w:t>Manuel d'animation</w:t>
       </w:r>
     </w:p>
     <w:p>
       <w:pPr>
+        <w:pStyle w:val="Subtitle"/>
+        <w:keepNext/>
         <w:keepLines/>
+        <w:spacing w:after="86" w:line="259" w:lineRule="auto"/>
       </w:pPr>
       <w:r>
         <w:rPr>
           <w:rFonts w:ascii="Arial" w:hAnsi="Arial"/>
+          <w:b/>
           <w:color w:val="000000"/>
           <w:sz w:val="20"/>
         </w:rPr>
@@ -32,11 +42,14 @@
     </w:p>
     <w:p>
       <w:pPr>
+        <w:keepNext/>
         <w:keepLines/>
+        <w:spacing w:after="86" w:line="259" w:lineRule="auto"/>
       </w:pPr>
       <w:r>
         <w:rPr>
           <w:rFonts w:ascii="Arial" w:hAnsi="Arial"/>
+          <w:b/>
           <w:color w:val="000000"/>
           <w:sz w:val="20"/>
         </w:rPr>
@@ -45,11 +58,14 @@
     </w:p>
     <w:p>
       <w:pPr>
+        <w:keepNext/>
         <w:keepLines/>
+        <w:spacing w:after="86" w:line="259" w:lineRule="auto"/>
       </w:pPr>
       <w:r>
         <w:rPr>
           <w:rFonts w:ascii="Arial" w:hAnsi="Arial"/>
+          <w:i/>
           <w:color w:val="000000"/>
           <w:sz w:val="20"/>
         </w:rPr>
@@ -59,14 +75,27 @@
     <w:p>
       <w:pPr>
         <w:pStyle w:val="Heading1"/>
+        <w:keepNext/>
+        <w:keepLines/>
+        <w:spacing w:before="180" w:after="60"/>
+        <w:pBdr>
+          <w:bottom w:val="single" w:sz="5" w:space="3" w:color="000000"/>
+        </w:pBdr>
       </w:pPr>
       <w:r>
+        <w:rPr>
+          <w:rFonts w:ascii="Arial" w:hAnsi="Arial"/>
+          <w:b/>
+          <w:color w:val="000000"/>
+          <w:sz w:val="26"/>
+        </w:rPr>
         <w:t>1. Objectif de l'activité</w:t>
       </w:r>
     </w:p>
     <w:p>
       <w:pPr>
         <w:keepLines/>
+        <w:spacing w:line="259" w:lineRule="auto" w:after="86"/>
       </w:pPr>
       <w:r>
         <w:rPr>
@@ -80,6 +109,7 @@
     <w:p>
       <w:pPr>
         <w:keepLines/>
+        <w:spacing w:line="259" w:lineRule="auto" w:after="86"/>
       </w:pPr>
       <w:r>
         <w:rPr>
@@ -93,15 +123,27 @@
     <w:p>
       <w:pPr>
         <w:pStyle w:val="Heading1"/>
+        <w:keepNext/>
+        <w:keepLines/>
+        <w:spacing w:before="180" w:after="60"/>
+        <w:pBdr>
+          <w:bottom w:val="single" w:sz="5" w:space="3" w:color="000000"/>
+        </w:pBdr>
       </w:pPr>
       <w:r>
+        <w:rPr>
+          <w:rFonts w:ascii="Arial" w:hAnsi="Arial"/>
+          <w:b/>
+          <w:color w:val="000000"/>
+          <w:sz w:val="26"/>
+        </w:rPr>
         <w:t>2. Préparation avant l'arrivée du public</w:t>
       </w:r>
     </w:p>
     <w:p>
       <w:pPr>
         <w:keepLines/>
-        <w:spacing w:after="40"/>
+        <w:spacing w:after="50" w:line="259" w:lineRule="auto"/>
         <w:ind w:left="312" w:hanging="255"/>
       </w:pPr>
       <w:r>
@@ -116,7 +158,7 @@
     <w:p>
       <w:pPr>
         <w:keepLines/>
-        <w:spacing w:after="40"/>
+        <w:spacing w:after="50" w:line="259" w:lineRule="auto"/>
         <w:ind w:left="312" w:hanging="255"/>
       </w:pPr>
       <w:r>
@@ -131,7 +173,7 @@
     <w:p>
       <w:pPr>
         <w:keepLines/>
-        <w:spacing w:after="40"/>
+        <w:spacing w:after="50" w:line="259" w:lineRule="auto"/>
         <w:ind w:left="312" w:hanging="255"/>
       </w:pPr>
       <w:r>
@@ -146,7 +188,7 @@
     <w:p>
       <w:pPr>
         <w:keepLines/>
-        <w:spacing w:after="40"/>
+        <w:spacing w:after="50" w:line="259" w:lineRule="auto"/>
         <w:ind w:left="312" w:hanging="255"/>
       </w:pPr>
       <w:r>
@@ -161,7 +203,7 @@
     <w:p>
       <w:pPr>
         <w:keepLines/>
-        <w:spacing w:after="40"/>
+        <w:spacing w:after="50" w:line="259" w:lineRule="auto"/>
         <w:ind w:left="312" w:hanging="255"/>
       </w:pPr>
       <w:r>
@@ -176,7 +218,7 @@
     <w:p>
       <w:pPr>
         <w:keepLines/>
-        <w:spacing w:after="40"/>
+        <w:spacing w:after="50" w:line="259" w:lineRule="auto"/>
         <w:ind w:left="312" w:hanging="255"/>
       </w:pPr>
       <w:r>
@@ -191,7 +233,7 @@
     <w:p>
       <w:pPr>
         <w:keepLines/>
-        <w:spacing w:after="40"/>
+        <w:spacing w:after="50" w:line="259" w:lineRule="auto"/>
         <w:ind w:left="312" w:hanging="255"/>
       </w:pPr>
       <w:r>
@@ -206,6 +248,7 @@
     <w:p>
       <w:pPr>
         <w:keepLines/>
+        <w:spacing w:line="259" w:lineRule="auto" w:after="86"/>
       </w:pPr>
       <w:r>
         <w:rPr>
@@ -219,14 +262,27 @@
     <w:p>
       <w:pPr>
         <w:pStyle w:val="Heading1"/>
+        <w:keepNext/>
+        <w:keepLines/>
+        <w:spacing w:before="180" w:after="60"/>
+        <w:pBdr>
+          <w:bottom w:val="single" w:sz="5" w:space="3" w:color="000000"/>
+        </w:pBdr>
       </w:pPr>
       <w:r>
+        <w:rPr>
+          <w:rFonts w:ascii="Arial" w:hAnsi="Arial"/>
+          <w:b/>
+          <w:color w:val="000000"/>
+          <w:sz w:val="26"/>
+        </w:rPr>
         <w:t>3. Présentation à dire au visiteur</w:t>
       </w:r>
     </w:p>
     <w:p>
       <w:pPr>
         <w:keepLines/>
+        <w:spacing w:line="259" w:lineRule="auto" w:after="86"/>
       </w:pPr>
       <w:r>
         <w:rPr>
@@ -240,22 +296,44 @@
     <w:p>
       <w:pPr>
         <w:pStyle w:val="Heading1"/>
+        <w:keepNext/>
+        <w:keepLines/>
+        <w:spacing w:before="180" w:after="60"/>
+        <w:pBdr>
+          <w:bottom w:val="single" w:sz="5" w:space="3" w:color="000000"/>
+        </w:pBdr>
       </w:pPr>
       <w:r>
+        <w:rPr>
+          <w:rFonts w:ascii="Arial" w:hAnsi="Arial"/>
+          <w:b/>
+          <w:color w:val="000000"/>
+          <w:sz w:val="26"/>
+        </w:rPr>
         <w:t>4. Déroulement conseillé</w:t>
       </w:r>
     </w:p>
     <w:p>
       <w:pPr>
         <w:pStyle w:val="Heading2"/>
+        <w:keepNext/>
+        <w:keepLines/>
+        <w:spacing w:before="110" w:after="40"/>
       </w:pPr>
       <w:r>
+        <w:rPr>
+          <w:rFonts w:ascii="Arial" w:hAnsi="Arial"/>
+          <w:b/>
+          <w:color w:val="000000"/>
+          <w:sz w:val="21"/>
+        </w:rPr>
         <w:t>Accueil et contexte</w:t>
       </w:r>
     </w:p>
     <w:p>
       <w:pPr>
         <w:keepLines/>
+        <w:spacing w:line="259" w:lineRule="auto" w:after="86"/>
       </w:pPr>
       <w:r>
         <w:rPr>
@@ -269,6 +347,7 @@
     <w:p>
       <w:pPr>
         <w:keepLines/>
+        <w:spacing w:line="259" w:lineRule="auto" w:after="86"/>
       </w:pPr>
       <w:r>
         <w:rPr>
@@ -282,14 +361,24 @@
     <w:p>
       <w:pPr>
         <w:pStyle w:val="Heading2"/>
+        <w:keepNext/>
+        <w:keepLines/>
+        <w:spacing w:before="110" w:after="40"/>
       </w:pPr>
       <w:r>
+        <w:rPr>
+          <w:rFonts w:ascii="Arial" w:hAnsi="Arial"/>
+          <w:b/>
+          <w:color w:val="000000"/>
+          <w:sz w:val="21"/>
+        </w:rPr>
         <w:t>Lecture de l'écran</w:t>
       </w:r>
     </w:p>
     <w:p>
       <w:pPr>
         <w:keepLines/>
+        <w:spacing w:line="259" w:lineRule="auto" w:after="86"/>
       </w:pPr>
       <w:r>
         <w:rPr>
@@ -303,6 +392,7 @@
     <w:p>
       <w:pPr>
         <w:keepLines/>
+        <w:spacing w:line="259" w:lineRule="auto" w:after="86"/>
       </w:pPr>
       <w:r>
         <w:rPr>
@@ -316,14 +406,24 @@
     <w:p>
       <w:pPr>
         <w:pStyle w:val="Heading2"/>
+        <w:keepNext/>
+        <w:keepLines/>
+        <w:spacing w:before="110" w:after="40"/>
       </w:pPr>
       <w:r>
+        <w:rPr>
+          <w:rFonts w:ascii="Arial" w:hAnsi="Arial"/>
+          <w:b/>
+          <w:color w:val="000000"/>
+          <w:sz w:val="21"/>
+        </w:rPr>
         <w:t>Les trois défis</w:t>
       </w:r>
     </w:p>
     <w:p>
       <w:pPr>
         <w:keepLines/>
+        <w:spacing w:line="259" w:lineRule="auto" w:after="86"/>
       </w:pPr>
       <w:r>
         <w:rPr>
@@ -337,6 +437,7 @@
     <w:p>
       <w:pPr>
         <w:keepLines/>
+        <w:spacing w:line="259" w:lineRule="auto" w:after="86"/>
       </w:pPr>
       <w:r>
         <w:rPr>
@@ -350,14 +451,24 @@
     <w:p>
       <w:pPr>
         <w:pStyle w:val="Heading2"/>
+        <w:keepNext/>
+        <w:keepLines/>
+        <w:spacing w:before="110" w:after="40"/>
       </w:pPr>
       <w:r>
+        <w:rPr>
+          <w:rFonts w:ascii="Arial" w:hAnsi="Arial"/>
+          <w:b/>
+          <w:color w:val="000000"/>
+          <w:sz w:val="21"/>
+        </w:rPr>
         <w:t>Bilan et réinitialisation</w:t>
       </w:r>
     </w:p>
     <w:p>
       <w:pPr>
         <w:keepLines/>
+        <w:spacing w:line="259" w:lineRule="auto" w:after="86"/>
       </w:pPr>
       <w:r>
         <w:rPr>
@@ -371,6 +482,7 @@
     <w:p>
       <w:pPr>
         <w:keepLines/>
+        <w:spacing w:line="259" w:lineRule="auto" w:after="86"/>
       </w:pPr>
       <w:r>
         <w:rPr>
@@ -384,6 +496,7 @@
     <w:p>
       <w:pPr>
         <w:keepLines/>
+        <w:spacing w:line="259" w:lineRule="auto" w:after="86"/>
       </w:pPr>
       <w:r>
         <w:rPr>
@@ -397,22 +510,44 @@
     <w:p>
       <w:pPr>
         <w:pStyle w:val="Heading1"/>
+        <w:keepNext/>
+        <w:keepLines/>
+        <w:spacing w:before="180" w:after="60"/>
+        <w:pBdr>
+          <w:bottom w:val="single" w:sz="5" w:space="3" w:color="000000"/>
+        </w:pBdr>
       </w:pPr>
       <w:r>
+        <w:rPr>
+          <w:rFonts w:ascii="Arial" w:hAnsi="Arial"/>
+          <w:b/>
+          <w:color w:val="000000"/>
+          <w:sz w:val="26"/>
+        </w:rPr>
         <w:t>5. Les trois défis</w:t>
       </w:r>
     </w:p>
     <w:p>
       <w:pPr>
         <w:pStyle w:val="Heading2"/>
+        <w:keepNext/>
+        <w:keepLines/>
+        <w:spacing w:before="110" w:after="40"/>
       </w:pPr>
       <w:r>
+        <w:rPr>
+          <w:rFonts w:ascii="Arial" w:hAnsi="Arial"/>
+          <w:b/>
+          <w:color w:val="000000"/>
+          <w:sz w:val="21"/>
+        </w:rPr>
         <w:t>Défi 1 : le genre préféré</w:t>
       </w:r>
     </w:p>
     <w:p>
       <w:pPr>
         <w:keepLines/>
+        <w:spacing w:line="259" w:lineRule="auto" w:after="86"/>
       </w:pPr>
       <w:r>
         <w:rPr>
@@ -426,6 +561,7 @@
     <w:p>
       <w:pPr>
         <w:keepLines/>
+        <w:spacing w:line="259" w:lineRule="auto" w:after="86"/>
       </w:pPr>
       <w:r>
         <w:rPr>
@@ -439,8 +575,12 @@
     <w:p>
       <w:pPr>
         <w:keepLines/>
-        <w:spacing w:before="20" w:after="80"/>
-        <w:ind w:left="312" w:right="142"/>
+        <w:spacing w:before="60" w:after="120" w:line="240" w:lineRule="auto"/>
+        <w:ind w:left="198" w:right="85"/>
+        <w:shd w:val="clear" w:fill="F4F4F4"/>
+        <w:pBdr>
+          <w:left w:val="single" w:sz="10" w:space="5" w:color="000000"/>
+        </w:pBdr>
       </w:pPr>
       <w:r>
         <w:rPr>
@@ -470,6 +610,7 @@
     <w:p>
       <w:pPr>
         <w:keepLines/>
+        <w:spacing w:line="259" w:lineRule="auto" w:after="86"/>
       </w:pPr>
       <w:r>
         <w:rPr>
@@ -483,14 +624,24 @@
     <w:p>
       <w:pPr>
         <w:pStyle w:val="Heading2"/>
+        <w:keepNext/>
+        <w:keepLines/>
+        <w:spacing w:before="110" w:after="40"/>
       </w:pPr>
       <w:r>
+        <w:rPr>
+          <w:rFonts w:ascii="Arial" w:hAnsi="Arial"/>
+          <w:b/>
+          <w:color w:val="000000"/>
+          <w:sz w:val="21"/>
+        </w:rPr>
         <w:t>Défi 2 : le cinéma le plus fréquenté</w:t>
       </w:r>
     </w:p>
     <w:p>
       <w:pPr>
         <w:keepLines/>
+        <w:spacing w:line="259" w:lineRule="auto" w:after="86"/>
       </w:pPr>
       <w:r>
         <w:rPr>
@@ -504,6 +655,7 @@
     <w:p>
       <w:pPr>
         <w:keepLines/>
+        <w:spacing w:line="259" w:lineRule="auto" w:after="86"/>
       </w:pPr>
       <w:r>
         <w:rPr>
@@ -517,8 +669,12 @@
     <w:p>
       <w:pPr>
         <w:keepLines/>
-        <w:spacing w:before="20" w:after="80"/>
-        <w:ind w:left="312" w:right="142"/>
+        <w:spacing w:before="60" w:after="120" w:line="240" w:lineRule="auto"/>
+        <w:ind w:left="198" w:right="85"/>
+        <w:shd w:val="clear" w:fill="F4F4F4"/>
+        <w:pBdr>
+          <w:left w:val="single" w:sz="10" w:space="5" w:color="000000"/>
+        </w:pBdr>
       </w:pPr>
       <w:r>
         <w:rPr>
@@ -548,6 +704,7 @@
     <w:p>
       <w:pPr>
         <w:keepLines/>
+        <w:spacing w:line="259" w:lineRule="auto" w:after="86"/>
       </w:pPr>
       <w:r>
         <w:rPr>
@@ -561,14 +718,24 @@
     <w:p>
       <w:pPr>
         <w:pStyle w:val="Heading2"/>
+        <w:keepNext/>
+        <w:keepLines/>
+        <w:spacing w:before="110" w:after="40"/>
       </w:pPr>
       <w:r>
+        <w:rPr>
+          <w:rFonts w:ascii="Arial" w:hAnsi="Arial"/>
+          <w:b/>
+          <w:color w:val="000000"/>
+          <w:sz w:val="21"/>
+        </w:rPr>
         <w:t>Défi 3 : le jour le plus fréquent</w:t>
       </w:r>
     </w:p>
     <w:p>
       <w:pPr>
         <w:keepLines/>
+        <w:spacing w:line="259" w:lineRule="auto" w:after="86"/>
       </w:pPr>
       <w:r>
         <w:rPr>
@@ -582,6 +749,7 @@
     <w:p>
       <w:pPr>
         <w:keepLines/>
+        <w:spacing w:line="259" w:lineRule="auto" w:after="86"/>
       </w:pPr>
       <w:r>
         <w:rPr>
@@ -595,8 +763,12 @@
     <w:p>
       <w:pPr>
         <w:keepLines/>
-        <w:spacing w:before="20" w:after="80"/>
-        <w:ind w:left="312" w:right="142"/>
+        <w:spacing w:before="60" w:after="120" w:line="240" w:lineRule="auto"/>
+        <w:ind w:left="198" w:right="85"/>
+        <w:shd w:val="clear" w:fill="F4F4F4"/>
+        <w:pBdr>
+          <w:left w:val="single" w:sz="10" w:space="5" w:color="000000"/>
+        </w:pBdr>
       </w:pPr>
       <w:r>
         <w:rPr>
@@ -620,6 +792,7 @@
     <w:p>
       <w:pPr>
         <w:keepLines/>
+        <w:spacing w:line="259" w:lineRule="auto" w:after="86"/>
       </w:pPr>
       <w:r>
         <w:rPr>
@@ -633,6 +806,7 @@
     <w:p>
       <w:pPr>
         <w:keepLines/>
+        <w:spacing w:line="259" w:lineRule="auto" w:after="86"/>
       </w:pPr>
       <w:r>
         <w:rPr>
@@ -646,14 +820,27 @@
     <w:p>
       <w:pPr>
         <w:pStyle w:val="Heading1"/>
+        <w:keepNext/>
+        <w:keepLines/>
+        <w:spacing w:before="180" w:after="60"/>
+        <w:pBdr>
+          <w:bottom w:val="single" w:sz="5" w:space="3" w:color="000000"/>
+        </w:pBdr>
       </w:pPr>
       <w:r>
+        <w:rPr>
+          <w:rFonts w:ascii="Arial" w:hAnsi="Arial"/>
+          <w:b/>
+          <w:color w:val="000000"/>
+          <w:sz w:val="26"/>
+        </w:rPr>
         <w:t>6. Répartition attendue des données</w:t>
       </w:r>
     </w:p>
     <w:p>
       <w:pPr>
         <w:keepLines/>
+        <w:spacing w:line="259" w:lineRule="auto" w:after="86"/>
       </w:pPr>
       <w:r>
         <w:rPr>
@@ -667,6 +854,7 @@
     <w:p>
       <w:pPr>
         <w:keepLines/>
+        <w:spacing w:line="259" w:lineRule="auto" w:after="86"/>
       </w:pPr>
       <w:r>
         <w:rPr>
@@ -680,6 +868,7 @@
     <w:p>
       <w:pPr>
         <w:keepLines/>
+        <w:spacing w:line="259" w:lineRule="auto" w:after="86"/>
       </w:pPr>
       <w:r>
         <w:rPr>
@@ -693,6 +882,7 @@
     <w:p>
       <w:pPr>
         <w:keepLines/>
+        <w:spacing w:line="259" w:lineRule="auto" w:after="86"/>
       </w:pPr>
       <w:r>
         <w:rPr>
@@ -706,22 +896,44 @@
     <w:p>
       <w:pPr>
         <w:pStyle w:val="Heading1"/>
+        <w:keepNext/>
+        <w:keepLines/>
+        <w:spacing w:before="180" w:after="60"/>
+        <w:pBdr>
+          <w:bottom w:val="single" w:sz="5" w:space="3" w:color="000000"/>
+        </w:pBdr>
       </w:pPr>
       <w:r>
+        <w:rPr>
+          <w:rFonts w:ascii="Arial" w:hAnsi="Arial"/>
+          <w:b/>
+          <w:color w:val="000000"/>
+          <w:sz w:val="26"/>
+        </w:rPr>
         <w:t>7. Notions SQL à expliquer</w:t>
       </w:r>
     </w:p>
     <w:p>
       <w:pPr>
         <w:pStyle w:val="Heading2"/>
+        <w:keepNext/>
+        <w:keepLines/>
+        <w:spacing w:before="110" w:after="40"/>
       </w:pPr>
       <w:r>
+        <w:rPr>
+          <w:rFonts w:ascii="Arial" w:hAnsi="Arial"/>
+          <w:b/>
+          <w:color w:val="000000"/>
+          <w:sz w:val="21"/>
+        </w:rPr>
         <w:t>SELECT</w:t>
       </w:r>
     </w:p>
     <w:p>
       <w:pPr>
         <w:keepLines/>
+        <w:spacing w:line="259" w:lineRule="auto" w:after="86"/>
       </w:pPr>
       <w:r>
         <w:rPr>
@@ -735,14 +947,24 @@
     <w:p>
       <w:pPr>
         <w:pStyle w:val="Heading2"/>
+        <w:keepNext/>
+        <w:keepLines/>
+        <w:spacing w:before="110" w:after="40"/>
       </w:pPr>
       <w:r>
+        <w:rPr>
+          <w:rFonts w:ascii="Arial" w:hAnsi="Arial"/>
+          <w:b/>
+          <w:color w:val="000000"/>
+          <w:sz w:val="21"/>
+        </w:rPr>
         <w:t>JOIN</w:t>
       </w:r>
     </w:p>
     <w:p>
       <w:pPr>
         <w:keepLines/>
+        <w:spacing w:line="259" w:lineRule="auto" w:after="86"/>
       </w:pPr>
       <w:r>
         <w:rPr>
@@ -756,14 +978,24 @@
     <w:p>
       <w:pPr>
         <w:pStyle w:val="Heading2"/>
+        <w:keepNext/>
+        <w:keepLines/>
+        <w:spacing w:before="110" w:after="40"/>
       </w:pPr>
       <w:r>
+        <w:rPr>
+          <w:rFonts w:ascii="Arial" w:hAnsi="Arial"/>
+          <w:b/>
+          <w:color w:val="000000"/>
+          <w:sz w:val="21"/>
+        </w:rPr>
         <w:t>GROUP BY</w:t>
       </w:r>
     </w:p>
     <w:p>
       <w:pPr>
         <w:keepLines/>
+        <w:spacing w:line="259" w:lineRule="auto" w:after="86"/>
       </w:pPr>
       <w:r>
         <w:rPr>
@@ -777,14 +1009,24 @@
     <w:p>
       <w:pPr>
         <w:pStyle w:val="Heading2"/>
+        <w:keepNext/>
+        <w:keepLines/>
+        <w:spacing w:before="110" w:after="40"/>
       </w:pPr>
       <w:r>
+        <w:rPr>
+          <w:rFonts w:ascii="Arial" w:hAnsi="Arial"/>
+          <w:b/>
+          <w:color w:val="000000"/>
+          <w:sz w:val="21"/>
+        </w:rPr>
         <w:t>COUNT_BIG</w:t>
       </w:r>
     </w:p>
     <w:p>
       <w:pPr>
         <w:keepLines/>
+        <w:spacing w:line="259" w:lineRule="auto" w:after="86"/>
       </w:pPr>
       <w:r>
         <w:rPr>
@@ -798,14 +1040,24 @@
     <w:p>
       <w:pPr>
         <w:pStyle w:val="Heading2"/>
+        <w:keepNext/>
+        <w:keepLines/>
+        <w:spacing w:before="110" w:after="40"/>
       </w:pPr>
       <w:r>
+        <w:rPr>
+          <w:rFonts w:ascii="Arial" w:hAnsi="Arial"/>
+          <w:b/>
+          <w:color w:val="000000"/>
+          <w:sz w:val="21"/>
+        </w:rPr>
         <w:t>ORDER BY</w:t>
       </w:r>
     </w:p>
     <w:p>
       <w:pPr>
         <w:keepLines/>
+        <w:spacing w:line="259" w:lineRule="auto" w:after="86"/>
       </w:pPr>
       <w:r>
         <w:rPr>
@@ -819,14 +1071,24 @@
     <w:p>
       <w:pPr>
         <w:pStyle w:val="Heading2"/>
+        <w:keepNext/>
+        <w:keepLines/>
+        <w:spacing w:before="110" w:after="40"/>
       </w:pPr>
       <w:r>
+        <w:rPr>
+          <w:rFonts w:ascii="Arial" w:hAnsi="Arial"/>
+          <w:b/>
+          <w:color w:val="000000"/>
+          <w:sz w:val="21"/>
+        </w:rPr>
         <w:t>DATEPART</w:t>
       </w:r>
     </w:p>
     <w:p>
       <w:pPr>
         <w:keepLines/>
+        <w:spacing w:line="259" w:lineRule="auto" w:after="86"/>
       </w:pPr>
       <w:r>
         <w:rPr>
@@ -840,6 +1102,7 @@
     <w:p>
       <w:pPr>
         <w:keepLines/>
+        <w:spacing w:line="259" w:lineRule="auto" w:after="86"/>
       </w:pPr>
       <w:r>
         <w:rPr>
@@ -853,15 +1116,28 @@
     <w:p>
       <w:pPr>
         <w:pStyle w:val="Heading1"/>
+        <w:keepNext/>
+        <w:keepLines/>
+        <w:spacing w:before="180" w:after="60"/>
+        <w:pBdr>
+          <w:bottom w:val="single" w:sz="5" w:space="3" w:color="000000"/>
+        </w:pBdr>
       </w:pPr>
       <w:r>
+        <w:rPr>
+          <w:rFonts w:ascii="Arial" w:hAnsi="Arial"/>
+          <w:b/>
+          <w:color w:val="000000"/>
+          <w:sz w:val="26"/>
+        </w:rPr>
         <w:t>8. Questions possibles des visiteurs</w:t>
       </w:r>
     </w:p>
     <w:p>
       <w:pPr>
-        <w:spacing w:after="30"/>
-        <w:ind w:left="255" w:hanging="198"/>
+        <w:keepLines/>
+        <w:spacing w:after="40" w:line="259" w:lineRule="auto"/>
+        <w:ind w:left="312" w:hanging="198"/>
       </w:pPr>
       <w:r>
         <w:rPr>
@@ -874,8 +1150,9 @@
     </w:p>
     <w:p>
       <w:pPr>
-        <w:spacing w:after="30"/>
-        <w:ind w:left="255" w:hanging="198"/>
+        <w:keepLines/>
+        <w:spacing w:after="40" w:line="259" w:lineRule="auto"/>
+        <w:ind w:left="312" w:hanging="198"/>
       </w:pPr>
       <w:r>
         <w:rPr>
@@ -888,8 +1165,9 @@
     </w:p>
     <w:p>
       <w:pPr>
-        <w:spacing w:after="30"/>
-        <w:ind w:left="255" w:hanging="198"/>
+        <w:keepLines/>
+        <w:spacing w:after="40" w:line="259" w:lineRule="auto"/>
+        <w:ind w:left="312" w:hanging="198"/>
       </w:pPr>
       <w:r>
         <w:rPr>
@@ -902,8 +1180,9 @@
     </w:p>
     <w:p>
       <w:pPr>
-        <w:spacing w:after="30"/>
-        <w:ind w:left="255" w:hanging="198"/>
+        <w:keepLines/>
+        <w:spacing w:after="40" w:line="259" w:lineRule="auto"/>
+        <w:ind w:left="312" w:hanging="198"/>
       </w:pPr>
       <w:r>
         <w:rPr>
@@ -916,8 +1195,9 @@
     </w:p>
     <w:p>
       <w:pPr>
-        <w:spacing w:after="30"/>
-        <w:ind w:left="255" w:hanging="198"/>
+        <w:keepLines/>
+        <w:spacing w:after="40" w:line="259" w:lineRule="auto"/>
+        <w:ind w:left="312" w:hanging="198"/>
       </w:pPr>
       <w:r>
         <w:rPr>
@@ -931,15 +1211,28 @@
     <w:p>
       <w:pPr>
         <w:pStyle w:val="Heading1"/>
+        <w:keepNext/>
+        <w:keepLines/>
+        <w:spacing w:before="180" w:after="60"/>
+        <w:pBdr>
+          <w:bottom w:val="single" w:sz="5" w:space="3" w:color="000000"/>
+        </w:pBdr>
       </w:pPr>
       <w:r>
+        <w:rPr>
+          <w:rFonts w:ascii="Arial" w:hAnsi="Arial"/>
+          <w:b/>
+          <w:color w:val="000000"/>
+          <w:sz w:val="26"/>
+        </w:rPr>
         <w:t>9. Gestion des problèmes</w:t>
       </w:r>
     </w:p>
     <w:p>
       <w:pPr>
-        <w:spacing w:after="30"/>
-        <w:ind w:left="255" w:hanging="198"/>
+        <w:keepLines/>
+        <w:spacing w:after="40" w:line="259" w:lineRule="auto"/>
+        <w:ind w:left="312" w:hanging="198"/>
       </w:pPr>
       <w:r>
         <w:rPr>
@@ -952,8 +1245,9 @@
     </w:p>
     <w:p>
       <w:pPr>
-        <w:spacing w:after="30"/>
-        <w:ind w:left="255" w:hanging="198"/>
+        <w:keepLines/>
+        <w:spacing w:after="40" w:line="259" w:lineRule="auto"/>
+        <w:ind w:left="312" w:hanging="198"/>
       </w:pPr>
       <w:r>
         <w:rPr>
@@ -966,8 +1260,9 @@
     </w:p>
     <w:p>
       <w:pPr>
-        <w:spacing w:after="30"/>
-        <w:ind w:left="255" w:hanging="198"/>
+        <w:keepLines/>
+        <w:spacing w:after="40" w:line="259" w:lineRule="auto"/>
+        <w:ind w:left="312" w:hanging="198"/>
       </w:pPr>
       <w:r>
         <w:rPr>
@@ -980,8 +1275,9 @@
     </w:p>
     <w:p>
       <w:pPr>
-        <w:spacing w:after="30"/>
-        <w:ind w:left="255" w:hanging="198"/>
+        <w:keepLines/>
+        <w:spacing w:after="40" w:line="259" w:lineRule="auto"/>
+        <w:ind w:left="312" w:hanging="198"/>
       </w:pPr>
       <w:r>
         <w:rPr>
@@ -994,8 +1290,9 @@
     </w:p>
     <w:p>
       <w:pPr>
-        <w:spacing w:after="30"/>
-        <w:ind w:left="255" w:hanging="198"/>
+        <w:keepLines/>
+        <w:spacing w:after="40" w:line="259" w:lineRule="auto"/>
+        <w:ind w:left="312" w:hanging="198"/>
       </w:pPr>
       <w:r>
         <w:rPr>
@@ -1009,14 +1306,27 @@
     <w:p>
       <w:pPr>
         <w:pStyle w:val="Heading1"/>
+        <w:keepNext/>
+        <w:keepLines/>
+        <w:spacing w:before="180" w:after="60"/>
+        <w:pBdr>
+          <w:bottom w:val="single" w:sz="5" w:space="3" w:color="000000"/>
+        </w:pBdr>
       </w:pPr>
       <w:r>
+        <w:rPr>
+          <w:rFonts w:ascii="Arial" w:hAnsi="Arial"/>
+          <w:b/>
+          <w:color w:val="000000"/>
+          <w:sz w:val="26"/>
+        </w:rPr>
         <w:t>10. Fin de partie</w:t>
       </w:r>
     </w:p>
     <w:p>
       <w:pPr>
         <w:keepLines/>
+        <w:spacing w:line="259" w:lineRule="auto" w:after="86"/>
       </w:pPr>
       <w:r>
         <w:rPr>
@@ -1031,7 +1341,7 @@
       <w:headerReference w:type="default" r:id="rId9"/>
       <w:footerReference w:type="default" r:id="rId10"/>
       <w:pgSz w:w="11906" w:h="16838"/>
-      <w:pgMar w:top="850" w:right="1134" w:bottom="794" w:left="1134" w:header="720" w:footer="720" w:gutter="0"/>
+      <w:pgMar w:top="935" w:right="1134" w:bottom="850" w:left="1134" w:header="425" w:footer="425" w:gutter="0"/>
       <w:cols w:space="720"/>
       <w:docGrid w:linePitch="360"/>
     </w:sectPr>
@@ -1064,15 +1374,20 @@
   <w:p>
     <w:pPr>
       <w:pStyle w:val="Header"/>
+      <w:spacing w:after="40"/>
       <w:jc w:val="right"/>
+      <w:pBdr>
+        <w:bottom w:val="single" w:sz="4" w:space="4" w:color="000000"/>
+      </w:pBdr>
     </w:pPr>
     <w:r>
       <w:rPr>
         <w:rFonts w:ascii="Arial" w:hAnsi="Arial"/>
+        <w:b/>
         <w:color w:val="000000"/>
-        <w:sz w:val="16"/>
-      </w:rPr>
-      <w:t>ETML - JOURNÉES PORTES OUVERTES</w:t>
+        <w:sz w:val="15"/>
+      </w:rPr>
+      <w:t>ETML  |  JOURNÉES PORTES OUVERTES</w:t>
     </w:r>
   </w:p>
 </w:hdr>
@@ -1446,6 +1761,8 @@
     </w:pPr>
     <w:rPr>
       <w:rFonts w:ascii="Arial" w:hAnsi="Arial"/>
+      <w:b w:val="0"/>
+      <w:i w:val="0"/>
       <w:color w:val="000000"/>
       <w:sz w:val="20"/>
     </w:rPr>
@@ -1464,6 +1781,9 @@
       </w:tabs>
       <w:spacing w:after="0" w:line="240" w:lineRule="auto"/>
     </w:pPr>
+    <w:rPr>
+      <w:color w:val="000000"/>
+    </w:rPr>
   </w:style>
   <w:style w:type="character" w:customStyle="1" w:styleId="HeaderChar">
     <w:name w:val="Header Char"/>
@@ -1471,6 +1791,9 @@
     <w:link w:val="Header"/>
     <w:uiPriority w:val="99"/>
     <w:rsid w:val="00E618BF"/>
+    <w:rPr>
+      <w:color w:val="000000"/>
+    </w:rPr>
   </w:style>
   <w:style w:type="paragraph" w:styleId="Footer">
     <w:name w:val="footer"/>
@@ -1486,6 +1809,9 @@
       </w:tabs>
       <w:spacing w:after="0" w:line="240" w:lineRule="auto"/>
     </w:pPr>
+    <w:rPr>
+      <w:color w:val="000000"/>
+    </w:rPr>
   </w:style>
   <w:style w:type="character" w:customStyle="1" w:styleId="FooterChar">
     <w:name w:val="Footer Char"/>
@@ -1493,6 +1819,9 @@
     <w:link w:val="Footer"/>
     <w:uiPriority w:val="99"/>
     <w:rsid w:val="00E618BF"/>
+    <w:rPr>
+      <w:color w:val="000000"/>
+    </w:rPr>
   </w:style>
   <w:style w:type="paragraph" w:styleId="Heading1">
     <w:name w:val="heading 1"/>
@@ -1512,8 +1841,9 @@
       <w:rFonts w:asciiTheme="majorHAnsi" w:eastAsiaTheme="majorEastAsia" w:hAnsiTheme="majorHAnsi" w:cstheme="majorBidi" w:ascii="Arial" w:hAnsi="Arial"/>
       <w:b/>
       <w:bCs/>
+      <w:i w:val="0"/>
       <w:color w:val="000000"/>
-      <w:sz w:val="29"/>
+      <w:sz w:val="26"/>
       <w:szCs w:val="28"/>
     </w:rPr>
   </w:style>
@@ -1536,8 +1866,9 @@
       <w:rFonts w:asciiTheme="majorHAnsi" w:eastAsiaTheme="majorEastAsia" w:hAnsiTheme="majorHAnsi" w:cstheme="majorBidi" w:ascii="Arial" w:hAnsi="Arial"/>
       <w:b/>
       <w:bCs/>
+      <w:i w:val="0"/>
       <w:color w:val="000000"/>
-      <w:sz w:val="23"/>
+      <w:sz w:val="21"/>
       <w:szCs w:val="26"/>
     </w:rPr>
   </w:style>
@@ -1560,8 +1891,9 @@
       <w:rFonts w:asciiTheme="majorHAnsi" w:eastAsiaTheme="majorEastAsia" w:hAnsiTheme="majorHAnsi" w:cstheme="majorBidi" w:ascii="Arial" w:hAnsi="Arial"/>
       <w:b/>
       <w:bCs/>
+      <w:i/>
       <w:color w:val="000000"/>
-      <w:sz w:val="21"/>
+      <w:sz w:val="20"/>
     </w:rPr>
   </w:style>
   <w:style w:type="paragraph" w:styleId="Heading4">
@@ -1586,7 +1918,7 @@
       <w:bCs/>
       <w:i/>
       <w:iCs/>
-      <w:color w:val="4F81BD" w:themeColor="accent1"/>
+      <w:color w:val="000000"/>
     </w:rPr>
   </w:style>
   <w:style w:type="paragraph" w:styleId="Heading5">
@@ -1607,7 +1939,7 @@
     </w:pPr>
     <w:rPr>
       <w:rFonts w:asciiTheme="majorHAnsi" w:eastAsiaTheme="majorEastAsia" w:hAnsiTheme="majorHAnsi" w:cstheme="majorBidi"/>
-      <w:color w:val="243F60" w:themeColor="accent1" w:themeShade="7F"/>
+      <w:color w:val="000000"/>
     </w:rPr>
   </w:style>
   <w:style w:type="paragraph" w:styleId="Heading6">
@@ -1630,7 +1962,7 @@
       <w:rFonts w:asciiTheme="majorHAnsi" w:eastAsiaTheme="majorEastAsia" w:hAnsiTheme="majorHAnsi" w:cstheme="majorBidi"/>
       <w:i/>
       <w:iCs/>
-      <w:color w:val="243F60" w:themeColor="accent1" w:themeShade="7F"/>
+      <w:color w:val="000000"/>
     </w:rPr>
   </w:style>
   <w:style w:type="paragraph" w:styleId="Heading7">
@@ -1653,7 +1985,7 @@
       <w:rFonts w:asciiTheme="majorHAnsi" w:eastAsiaTheme="majorEastAsia" w:hAnsiTheme="majorHAnsi" w:cstheme="majorBidi"/>
       <w:i/>
       <w:iCs/>
-      <w:color w:val="404040" w:themeColor="text1" w:themeTint="BF"/>
+      <w:color w:val="000000"/>
     </w:rPr>
   </w:style>
   <w:style w:type="paragraph" w:styleId="Heading8">
@@ -1674,7 +2006,7 @@
     </w:pPr>
     <w:rPr>
       <w:rFonts w:asciiTheme="majorHAnsi" w:eastAsiaTheme="majorEastAsia" w:hAnsiTheme="majorHAnsi" w:cstheme="majorBidi"/>
-      <w:color w:val="4F81BD" w:themeColor="accent1"/>
+      <w:color w:val="000000"/>
       <w:sz w:val="20"/>
       <w:szCs w:val="20"/>
     </w:rPr>
@@ -1699,7 +2031,7 @@
       <w:rFonts w:asciiTheme="majorHAnsi" w:eastAsiaTheme="majorEastAsia" w:hAnsiTheme="majorHAnsi" w:cstheme="majorBidi"/>
       <w:i/>
       <w:iCs/>
-      <w:color w:val="404040" w:themeColor="text1" w:themeTint="BF"/>
+      <w:color w:val="000000"/>
       <w:sz w:val="20"/>
       <w:szCs w:val="20"/>
     </w:rPr>
@@ -1709,12 +2041,18 @@
     <w:uiPriority w:val="1"/>
     <w:semiHidden/>
     <w:unhideWhenUsed/>
+    <w:rPr>
+      <w:color w:val="000000"/>
+    </w:rPr>
   </w:style>
   <w:style w:type="table" w:default="1" w:styleId="TableNormal">
     <w:name w:val="Normal Table"/>
     <w:uiPriority w:val="99"/>
     <w:semiHidden/>
     <w:unhideWhenUsed/>
+    <w:rPr>
+      <w:color w:val="000000"/>
+    </w:rPr>
     <w:tblPr>
       <w:tblInd w:w="0" w:type="dxa"/>
       <w:tblCellMar>
@@ -1739,6 +2077,9 @@
     <w:pPr>
       <w:spacing w:after="0" w:line="240" w:lineRule="auto"/>
     </w:pPr>
+    <w:rPr>
+      <w:color w:val="000000"/>
+    </w:rPr>
   </w:style>
   <w:style w:type="character" w:customStyle="1" w:styleId="Heading1Char">
     <w:name w:val="Heading 1 Char"/>
@@ -1750,7 +2091,7 @@
       <w:rFonts w:asciiTheme="majorHAnsi" w:eastAsiaTheme="majorEastAsia" w:hAnsiTheme="majorHAnsi" w:cstheme="majorBidi"/>
       <w:b/>
       <w:bCs/>
-      <w:color w:val="365F91" w:themeColor="accent1" w:themeShade="BF"/>
+      <w:color w:val="000000"/>
       <w:sz w:val="28"/>
       <w:szCs w:val="28"/>
     </w:rPr>
@@ -1765,7 +2106,7 @@
       <w:rFonts w:asciiTheme="majorHAnsi" w:eastAsiaTheme="majorEastAsia" w:hAnsiTheme="majorHAnsi" w:cstheme="majorBidi"/>
       <w:b/>
       <w:bCs/>
-      <w:color w:val="4F81BD" w:themeColor="accent1"/>
+      <w:color w:val="000000"/>
       <w:sz w:val="26"/>
       <w:szCs w:val="26"/>
     </w:rPr>
@@ -1780,7 +2121,7 @@
       <w:rFonts w:asciiTheme="majorHAnsi" w:eastAsiaTheme="majorEastAsia" w:hAnsiTheme="majorHAnsi" w:cstheme="majorBidi"/>
       <w:b/>
       <w:bCs/>
-      <w:color w:val="4F81BD" w:themeColor="accent1"/>
+      <w:color w:val="000000"/>
     </w:rPr>
   </w:style>
   <w:style w:type="paragraph" w:styleId="Title">
@@ -1799,11 +2140,13 @@
       <w:contextualSpacing/>
     </w:pPr>
     <w:rPr>
-      <w:rFonts w:asciiTheme="majorHAnsi" w:eastAsiaTheme="majorEastAsia" w:hAnsiTheme="majorHAnsi" w:cstheme="majorBidi"/>
-      <w:color w:val="17365D" w:themeColor="text2" w:themeShade="BF"/>
+      <w:rFonts w:asciiTheme="majorHAnsi" w:eastAsiaTheme="majorEastAsia" w:hAnsiTheme="majorHAnsi" w:cstheme="majorBidi" w:ascii="Arial" w:hAnsi="Arial"/>
+      <w:b/>
+      <w:i w:val="0"/>
+      <w:color w:val="000000"/>
       <w:spacing w:val="5"/>
       <w:kern w:val="28"/>
-      <w:sz w:val="52"/>
+      <w:sz w:val="46"/>
       <w:szCs w:val="52"/>
     </w:rPr>
   </w:style>
@@ -1815,7 +2158,7 @@
     <w:rsid w:val="00FC693F"/>
     <w:rPr>
       <w:rFonts w:asciiTheme="majorHAnsi" w:eastAsiaTheme="majorEastAsia" w:hAnsiTheme="majorHAnsi" w:cstheme="majorBidi"/>
-      <w:color w:val="17365D" w:themeColor="text2" w:themeShade="BF"/>
+      <w:color w:val="000000"/>
       <w:spacing w:val="5"/>
       <w:kern w:val="28"/>
       <w:sz w:val="52"/>
@@ -1836,12 +2179,13 @@
       </w:numPr>
     </w:pPr>
     <w:rPr>
-      <w:rFonts w:asciiTheme="majorHAnsi" w:eastAsiaTheme="majorEastAsia" w:hAnsiTheme="majorHAnsi" w:cstheme="majorBidi"/>
-      <w:i/>
+      <w:rFonts w:asciiTheme="majorHAnsi" w:eastAsiaTheme="majorEastAsia" w:hAnsiTheme="majorHAnsi" w:cstheme="majorBidi" w:ascii="Arial" w:hAnsi="Arial"/>
+      <w:b/>
+      <w:i w:val="0"/>
       <w:iCs/>
-      <w:color w:val="4F81BD" w:themeColor="accent1"/>
+      <w:color w:val="000000"/>
       <w:spacing w:val="15"/>
-      <w:sz w:val="24"/>
+      <w:sz w:val="21"/>
       <w:szCs w:val="24"/>
     </w:rPr>
   </w:style>
@@ -1855,7 +2199,7 @@
       <w:rFonts w:asciiTheme="majorHAnsi" w:eastAsiaTheme="majorEastAsia" w:hAnsiTheme="majorHAnsi" w:cstheme="majorBidi"/>
       <w:i/>
       <w:iCs/>
-      <w:color w:val="4F81BD" w:themeColor="accent1"/>
+      <w:color w:val="000000"/>
       <w:spacing w:val="15"/>
       <w:sz w:val="24"/>
       <w:szCs w:val="24"/>
@@ -1871,6 +2215,9 @@
       <w:ind w:left="720"/>
       <w:contextualSpacing/>
     </w:pPr>
+    <w:rPr>
+      <w:color w:val="000000"/>
+    </w:rPr>
   </w:style>
   <w:style w:type="paragraph" w:styleId="BodyText">
     <w:name w:val="Body Text"/>
@@ -1882,6 +2229,9 @@
     <w:pPr>
       <w:spacing w:after="120"/>
     </w:pPr>
+    <w:rPr>
+      <w:color w:val="000000"/>
+    </w:rPr>
   </w:style>
   <w:style w:type="character" w:customStyle="1" w:styleId="BodyTextChar">
     <w:name w:val="Body Text Char"/>
@@ -1889,6 +2239,9 @@
     <w:link w:val="BodyText"/>
     <w:uiPriority w:val="99"/>
     <w:rsid w:val="00AA1D8D"/>
+    <w:rPr>
+      <w:color w:val="000000"/>
+    </w:rPr>
   </w:style>
   <w:style w:type="paragraph" w:styleId="BodyText2">
     <w:name w:val="Body Text 2"/>
@@ -1900,6 +2253,9 @@
     <w:pPr>
       <w:spacing w:after="120" w:line="480" w:lineRule="auto"/>
     </w:pPr>
+    <w:rPr>
+      <w:color w:val="000000"/>
+    </w:rPr>
   </w:style>
   <w:style w:type="character" w:customStyle="1" w:styleId="BodyText2Char">
     <w:name w:val="Body Text 2 Char"/>
@@ -1907,6 +2263,9 @@
     <w:link w:val="BodyText2"/>
     <w:uiPriority w:val="99"/>
     <w:rsid w:val="00AA1D8D"/>
+    <w:rPr>
+      <w:color w:val="000000"/>
+    </w:rPr>
   </w:style>
   <w:style w:type="paragraph" w:styleId="BodyText3">
     <w:name w:val="Body Text 3"/>
@@ -1919,6 +2278,7 @@
       <w:spacing w:after="120"/>
     </w:pPr>
     <w:rPr>
+      <w:color w:val="000000"/>
       <w:sz w:val="16"/>
       <w:szCs w:val="16"/>
     </w:rPr>
@@ -1930,6 +2290,7 @@
     <w:uiPriority w:val="99"/>
     <w:rsid w:val="00AA1D8D"/>
     <w:rPr>
+      <w:color w:val="000000"/>
       <w:sz w:val="16"/>
       <w:szCs w:val="16"/>
     </w:rPr>
@@ -1944,6 +2305,9 @@
       <w:ind w:left="360" w:hanging="360"/>
       <w:contextualSpacing/>
     </w:pPr>
+    <w:rPr>
+      <w:color w:val="000000"/>
+    </w:rPr>
   </w:style>
   <w:style w:type="paragraph" w:styleId="List2">
     <w:name w:val="List 2"/>
@@ -1955,6 +2319,9 @@
       <w:ind w:left="720" w:hanging="360"/>
       <w:contextualSpacing/>
     </w:pPr>
+    <w:rPr>
+      <w:color w:val="000000"/>
+    </w:rPr>
   </w:style>
   <w:style w:type="paragraph" w:styleId="List3">
     <w:name w:val="List 3"/>
@@ -1966,6 +2333,9 @@
       <w:ind w:left="1080" w:hanging="360"/>
       <w:contextualSpacing/>
     </w:pPr>
+    <w:rPr>
+      <w:color w:val="000000"/>
+    </w:rPr>
   </w:style>
   <w:style w:type="paragraph" w:styleId="ListBullet">
     <w:name w:val="List Bullet"/>
@@ -1979,6 +2349,9 @@
       </w:numPr>
       <w:contextualSpacing/>
     </w:pPr>
+    <w:rPr>
+      <w:color w:val="000000"/>
+    </w:rPr>
   </w:style>
   <w:style w:type="paragraph" w:styleId="ListBullet2">
     <w:name w:val="List Bullet 2"/>
@@ -1992,6 +2365,9 @@
       </w:numPr>
       <w:contextualSpacing/>
     </w:pPr>
+    <w:rPr>
+      <w:color w:val="000000"/>
+    </w:rPr>
   </w:style>
   <w:style w:type="paragraph" w:styleId="ListBullet3">
     <w:name w:val="List Bullet 3"/>
@@ -2005,6 +2381,9 @@
       </w:numPr>
       <w:contextualSpacing/>
     </w:pPr>
+    <w:rPr>
+      <w:color w:val="000000"/>
+    </w:rPr>
   </w:style>
   <w:style w:type="paragraph" w:styleId="ListNumber">
     <w:name w:val="List Number"/>
@@ -2018,6 +2397,9 @@
       </w:numPr>
       <w:contextualSpacing/>
     </w:pPr>
+    <w:rPr>
+      <w:color w:val="000000"/>
+    </w:rPr>
   </w:style>
   <w:style w:type="paragraph" w:styleId="ListNumber2">
     <w:name w:val="List Number 2"/>
@@ -2031,6 +2413,9 @@
       </w:numPr>
       <w:contextualSpacing/>
     </w:pPr>
+    <w:rPr>
+      <w:color w:val="000000"/>
+    </w:rPr>
   </w:style>
   <w:style w:type="paragraph" w:styleId="ListNumber3">
     <w:name w:val="List Number 3"/>
@@ -2044,6 +2429,9 @@
       </w:numPr>
       <w:contextualSpacing/>
     </w:pPr>
+    <w:rPr>
+      <w:color w:val="000000"/>
+    </w:rPr>
   </w:style>
   <w:style w:type="paragraph" w:styleId="ListContinue">
     <w:name w:val="List Continue"/>
@@ -2056,6 +2444,9 @@
       <w:ind w:left="360"/>
       <w:contextualSpacing/>
     </w:pPr>
+    <w:rPr>
+      <w:color w:val="000000"/>
+    </w:rPr>
   </w:style>
   <w:style w:type="paragraph" w:styleId="ListContinue2">
     <w:name w:val="List Continue 2"/>
@@ -2068,6 +2459,9 @@
       <w:ind w:left="720"/>
       <w:contextualSpacing/>
     </w:pPr>
+    <w:rPr>
+      <w:color w:val="000000"/>
+    </w:rPr>
   </w:style>
   <w:style w:type="paragraph" w:styleId="ListContinue3">
     <w:name w:val="List Continue 3"/>
@@ -2080,6 +2474,9 @@
       <w:ind w:left="1080"/>
       <w:contextualSpacing/>
     </w:pPr>
+    <w:rPr>
+      <w:color w:val="000000"/>
+    </w:rPr>
   </w:style>
   <w:style w:type="paragraph" w:styleId="MacroText">
     <w:name w:val="macro"/>
@@ -2100,6 +2497,7 @@
     </w:pPr>
     <w:rPr>
       <w:rFonts w:ascii="Courier" w:hAnsi="Courier"/>
+      <w:color w:val="000000"/>
       <w:sz w:val="20"/>
       <w:szCs w:val="20"/>
     </w:rPr>
@@ -2112,6 +2510,7 @@
     <w:rsid w:val="0029639D"/>
     <w:rPr>
       <w:rFonts w:ascii="Courier" w:hAnsi="Courier"/>
+      <w:color w:val="000000"/>
       <w:sz w:val="20"/>
       <w:szCs w:val="20"/>
     </w:rPr>
@@ -2127,7 +2526,7 @@
     <w:rPr>
       <w:i/>
       <w:iCs/>
-      <w:color w:val="000000" w:themeColor="text1"/>
+      <w:color w:val="000000"/>
     </w:rPr>
   </w:style>
   <w:style w:type="character" w:customStyle="1" w:styleId="QuoteChar">
@@ -2139,7 +2538,7 @@
     <w:rPr>
       <w:i/>
       <w:iCs/>
-      <w:color w:val="000000" w:themeColor="text1"/>
+      <w:color w:val="000000"/>
     </w:rPr>
   </w:style>
   <w:style w:type="character" w:customStyle="1" w:styleId="Heading4Char">
@@ -2155,7 +2554,7 @@
       <w:bCs/>
       <w:i/>
       <w:iCs/>
-      <w:color w:val="4F81BD" w:themeColor="accent1"/>
+      <w:color w:val="000000"/>
     </w:rPr>
   </w:style>
   <w:style w:type="character" w:customStyle="1" w:styleId="Heading5Char">
@@ -2167,7 +2566,7 @@
     <w:rsid w:val="00FC693F"/>
     <w:rPr>
       <w:rFonts w:asciiTheme="majorHAnsi" w:eastAsiaTheme="majorEastAsia" w:hAnsiTheme="majorHAnsi" w:cstheme="majorBidi"/>
-      <w:color w:val="243F60" w:themeColor="accent1" w:themeShade="7F"/>
+      <w:color w:val="000000"/>
     </w:rPr>
   </w:style>
   <w:style w:type="character" w:customStyle="1" w:styleId="Heading6Char">
@@ -2181,7 +2580,7 @@
       <w:rFonts w:asciiTheme="majorHAnsi" w:eastAsiaTheme="majorEastAsia" w:hAnsiTheme="majorHAnsi" w:cstheme="majorBidi"/>
       <w:i/>
       <w:iCs/>
-      <w:color w:val="243F60" w:themeColor="accent1" w:themeShade="7F"/>
+      <w:color w:val="000000"/>
     </w:rPr>
   </w:style>
   <w:style w:type="character" w:customStyle="1" w:styleId="Heading7Char">
@@ -2195,7 +2594,7 @@
       <w:rFonts w:asciiTheme="majorHAnsi" w:eastAsiaTheme="majorEastAsia" w:hAnsiTheme="majorHAnsi" w:cstheme="majorBidi"/>
       <w:i/>
       <w:iCs/>
-      <w:color w:val="404040" w:themeColor="text1" w:themeTint="BF"/>
+      <w:color w:val="000000"/>
     </w:rPr>
   </w:style>
   <w:style w:type="character" w:customStyle="1" w:styleId="Heading8Char">
@@ -2207,7 +2606,7 @@
     <w:rsid w:val="00FC693F"/>
     <w:rPr>
       <w:rFonts w:asciiTheme="majorHAnsi" w:eastAsiaTheme="majorEastAsia" w:hAnsiTheme="majorHAnsi" w:cstheme="majorBidi"/>
-      <w:color w:val="4F81BD" w:themeColor="accent1"/>
+      <w:color w:val="000000"/>
       <w:sz w:val="20"/>
       <w:szCs w:val="20"/>
     </w:rPr>
@@ -2223,7 +2622,7 @@
       <w:rFonts w:asciiTheme="majorHAnsi" w:eastAsiaTheme="majorEastAsia" w:hAnsiTheme="majorHAnsi" w:cstheme="majorBidi"/>
       <w:i/>
       <w:iCs/>
-      <w:color w:val="404040" w:themeColor="text1" w:themeTint="BF"/>
+      <w:color w:val="000000"/>
       <w:sz w:val="20"/>
       <w:szCs w:val="20"/>
     </w:rPr>
@@ -2243,7 +2642,7 @@
     <w:rPr>
       <w:b/>
       <w:bCs/>
-      <w:color w:val="4F81BD" w:themeColor="accent1"/>
+      <w:color w:val="000000"/>
       <w:sz w:val="18"/>
       <w:szCs w:val="18"/>
     </w:rPr>
@@ -2257,6 +2656,7 @@
     <w:rPr>
       <w:b/>
       <w:bCs/>
+      <w:color w:val="000000"/>
     </w:rPr>
   </w:style>
   <w:style w:type="character" w:styleId="Emphasis">
@@ -2268,6 +2668,7 @@
     <w:rPr>
       <w:i/>
       <w:iCs/>
+      <w:color w:val="000000"/>
     </w:rPr>
   </w:style>
   <w:style w:type="paragraph" w:styleId="IntenseQuote">
@@ -2290,7 +2691,7 @@
       <w:bCs/>
       <w:i/>
       <w:iCs/>
-      <w:color w:val="4F81BD" w:themeColor="accent1"/>
+      <w:color w:val="000000"/>
     </w:rPr>
   </w:style>
   <w:style w:type="character" w:customStyle="1" w:styleId="IntenseQuoteChar">
@@ -2304,7 +2705,7 @@
       <w:bCs/>
       <w:i/>
       <w:iCs/>
-      <w:color w:val="4F81BD" w:themeColor="accent1"/>
+      <w:color w:val="000000"/>
     </w:rPr>
   </w:style>
   <w:style w:type="character" w:styleId="SubtleEmphasis">
@@ -2316,7 +2717,7 @@
     <w:rPr>
       <w:i/>
       <w:iCs/>
-      <w:color w:val="808080" w:themeColor="text1" w:themeTint="7F"/>
+      <w:color w:val="000000"/>
     </w:rPr>
   </w:style>
   <w:style w:type="character" w:styleId="IntenseEmphasis">
@@ -2330,7 +2731,7 @@
       <w:bCs/>
       <w:i/>
       <w:iCs/>
-      <w:color w:val="4F81BD" w:themeColor="accent1"/>
+      <w:color w:val="000000"/>
     </w:rPr>
   </w:style>
   <w:style w:type="character" w:styleId="SubtleReference">
@@ -2341,7 +2742,7 @@
     <w:rsid w:val="00FC693F"/>
     <w:rPr>
       <w:smallCaps/>
-      <w:color w:val="C0504D" w:themeColor="accent2"/>
+      <w:color w:val="000000"/>
       <w:u w:val="single"/>
     </w:rPr>
   </w:style>
@@ -2355,7 +2756,7 @@
       <w:b/>
       <w:bCs/>
       <w:smallCaps/>
-      <w:color w:val="C0504D" w:themeColor="accent2"/>
+      <w:color w:val="000000"/>
       <w:spacing w:val="5"/>
       <w:u w:val="single"/>
     </w:rPr>
@@ -2370,6 +2771,7 @@
       <w:b/>
       <w:bCs/>
       <w:smallCaps/>
+      <w:color w:val="000000"/>
       <w:spacing w:val="5"/>
     </w:rPr>
   </w:style>
@@ -2385,6 +2787,9 @@
     <w:pPr>
       <w:outlineLvl w:val="9"/>
     </w:pPr>
+    <w:rPr>
+      <w:color w:val="000000"/>
+    </w:rPr>
   </w:style>
   <w:style w:type="table" w:styleId="TableGrid">
     <w:name w:val="Table Grid"/>
@@ -2394,6 +2799,9 @@
     <w:pPr>
       <w:spacing w:after="0" w:line="240" w:lineRule="auto"/>
     </w:pPr>
+    <w:rPr>
+      <w:color w:val="000000"/>
+    </w:rPr>
     <w:tblPr>
       <w:tblInd w:w="0" w:type="dxa"/>
       <w:tblBorders>
@@ -2421,7 +2829,7 @@
       <w:spacing w:after="0" w:line="240" w:lineRule="auto"/>
     </w:pPr>
     <w:rPr>
-      <w:color w:val="000000" w:themeColor="text1" w:themeShade="BF"/>
+      <w:color w:val="000000"/>
     </w:rPr>
     <w:tblPr>
       <w:tblStyleRowBandSize w:val="1"/>
@@ -2524,7 +2932,7 @@
       <w:spacing w:after="0" w:line="240" w:lineRule="auto"/>
     </w:pPr>
     <w:rPr>
-      <w:color w:val="365F91" w:themeColor="accent1" w:themeShade="BF"/>
+      <w:color w:val="000000"/>
     </w:rPr>
     <w:tblPr>
       <w:tblStyleRowBandSize w:val="1"/>
@@ -2627,7 +3035,7 @@
       <w:spacing w:after="0" w:line="240" w:lineRule="auto"/>
     </w:pPr>
     <w:rPr>
-      <w:color w:val="943634" w:themeColor="accent2" w:themeShade="BF"/>
+      <w:color w:val="000000"/>
     </w:rPr>
     <w:tblPr>
       <w:tblStyleRowBandSize w:val="1"/>
@@ -2730,7 +3138,7 @@
       <w:spacing w:after="0" w:line="240" w:lineRule="auto"/>
     </w:pPr>
     <w:rPr>
-      <w:color w:val="76923C" w:themeColor="accent3" w:themeShade="BF"/>
+      <w:color w:val="000000"/>
     </w:rPr>
     <w:tblPr>
       <w:tblStyleRowBandSize w:val="1"/>
@@ -2833,7 +3241,7 @@
       <w:spacing w:after="0" w:line="240" w:lineRule="auto"/>
     </w:pPr>
     <w:rPr>
-      <w:color w:val="5F497A" w:themeColor="accent4" w:themeShade="BF"/>
+      <w:color w:val="000000"/>
     </w:rPr>
     <w:tblPr>
       <w:tblStyleRowBandSize w:val="1"/>
@@ -2936,7 +3344,7 @@
       <w:spacing w:after="0" w:line="240" w:lineRule="auto"/>
     </w:pPr>
     <w:rPr>
-      <w:color w:val="31849B" w:themeColor="accent5" w:themeShade="BF"/>
+      <w:color w:val="000000"/>
     </w:rPr>
     <w:tblPr>
       <w:tblStyleRowBandSize w:val="1"/>
@@ -3039,7 +3447,7 @@
       <w:spacing w:after="0" w:line="240" w:lineRule="auto"/>
     </w:pPr>
     <w:rPr>
-      <w:color w:val="E36C0A" w:themeColor="accent6" w:themeShade="BF"/>
+      <w:color w:val="000000"/>
     </w:rPr>
     <w:tblPr>
       <w:tblStyleRowBandSize w:val="1"/>
@@ -3141,6 +3549,9 @@
     <w:pPr>
       <w:spacing w:after="0" w:line="240" w:lineRule="auto"/>
     </w:pPr>
+    <w:rPr>
+      <w:color w:val="000000"/>
+    </w:rPr>
     <w:tblPr>
       <w:tblStyleRowBandSize w:val="1"/>
       <w:tblStyleColBandSize w:val="1"/>
@@ -3233,6 +3644,9 @@
     <w:pPr>
       <w:spacing w:after="0" w:line="240" w:lineRule="auto"/>
     </w:pPr>
+    <w:rPr>
+      <w:color w:val="000000"/>
+    </w:rPr>
     <w:tblPr>
       <w:tblStyleRowBandSize w:val="1"/>
       <w:tblStyleColBandSize w:val="1"/>
@@ -3325,6 +3739,9 @@
     <w:pPr>
       <w:spacing w:after="0" w:line="240" w:lineRule="auto"/>
     </w:pPr>
+    <w:rPr>
+      <w:color w:val="000000"/>
+    </w:rPr>
     <w:tblPr>
       <w:tblStyleRowBandSize w:val="1"/>
       <w:tblStyleColBandSize w:val="1"/>
@@ -3417,6 +3834,9 @@
     <w:pPr>
       <w:spacing w:after="0" w:line="240" w:lineRule="auto"/>
     </w:pPr>
+    <w:rPr>
+      <w:color w:val="000000"/>
+    </w:rPr>
     <w:tblPr>
       <w:tblStyleRowBandSize w:val="1"/>
       <w:tblStyleColBandSize w:val="1"/>
@@ -3509,6 +3929,9 @@
     <w:pPr>
       <w:spacing w:after="0" w:line="240" w:lineRule="auto"/>
     </w:pPr>
+    <w:rPr>
+      <w:color w:val="000000"/>
+    </w:rPr>
     <w:tblPr>
       <w:tblStyleRowBandSize w:val="1"/>
       <w:tblStyleColBandSize w:val="1"/>
@@ -3601,6 +4024,9 @@
     <w:pPr>
       <w:spacing w:after="0" w:line="240" w:lineRule="auto"/>
     </w:pPr>
+    <w:rPr>
+      <w:color w:val="000000"/>
+    </w:rPr>
     <w:tblPr>
       <w:tblStyleRowBandSize w:val="1"/>
       <w:tblStyleColBandSize w:val="1"/>
@@ -3693,6 +4119,9 @@
     <w:pPr>
       <w:spacing w:after="0" w:line="240" w:lineRule="auto"/>
     </w:pPr>
+    <w:rPr>
+      <w:color w:val="000000"/>
+    </w:rPr>
     <w:tblPr>
       <w:tblStyleRowBandSize w:val="1"/>
       <w:tblStyleColBandSize w:val="1"/>
@@ -3785,6 +4214,9 @@
     <w:pPr>
       <w:spacing w:after="0" w:line="240" w:lineRule="auto"/>
     </w:pPr>
+    <w:rPr>
+      <w:color w:val="000000"/>
+    </w:rPr>
     <w:tblPr>
       <w:tblStyleRowBandSize w:val="1"/>
       <w:tblStyleColBandSize w:val="1"/>
@@ -3915,6 +4347,9 @@
     <w:pPr>
       <w:spacing w:after="0" w:line="240" w:lineRule="auto"/>
     </w:pPr>
+    <w:rPr>
+      <w:color w:val="000000"/>
+    </w:rPr>
     <w:tblPr>
       <w:tblStyleRowBandSize w:val="1"/>
       <w:tblStyleColBandSize w:val="1"/>
@@ -4045,6 +4480,9 @@
     <w:pPr>
       <w:spacing w:after="0" w:line="240" w:lineRule="auto"/>
     </w:pPr>
+    <w:rPr>
+      <w:color w:val="000000"/>
+    </w:rPr>
     <w:tblPr>
       <w:tblStyleRowBandSize w:val="1"/>
       <w:tblStyleColBandSize w:val="1"/>
@@ -4175,6 +4613,9 @@
     <w:pPr>
       <w:spacing w:after="0" w:line="240" w:lineRule="auto"/>
     </w:pPr>
+    <w:rPr>
+      <w:color w:val="000000"/>
+    </w:rPr>
     <w:tblPr>
       <w:tblStyleRowBandSize w:val="1"/>
       <w:tblStyleColBandSize w:val="1"/>
@@ -4305,6 +4746,9 @@
     <w:pPr>
       <w:spacing w:after="0" w:line="240" w:lineRule="auto"/>
     </w:pPr>
+    <w:rPr>
+      <w:color w:val="000000"/>
+    </w:rPr>
     <w:tblPr>
       <w:tblStyleRowBandSize w:val="1"/>
       <w:tblStyleColBandSize w:val="1"/>
@@ -4435,6 +4879,9 @@
     <w:pPr>
       <w:spacing w:after="0" w:line="240" w:lineRule="auto"/>
     </w:pPr>
+    <w:rPr>
+      <w:color w:val="000000"/>
+    </w:rPr>
     <w:tblPr>
       <w:tblStyleRowBandSize w:val="1"/>
       <w:tblStyleColBandSize w:val="1"/>
@@ -4565,6 +5012,9 @@
     <w:pPr>
       <w:spacing w:after="0" w:line="240" w:lineRule="auto"/>
     </w:pPr>
+    <w:rPr>
+      <w:color w:val="000000"/>
+    </w:rPr>
     <w:tblPr>
       <w:tblStyleRowBandSize w:val="1"/>
       <w:tblStyleColBandSize w:val="1"/>
@@ -4695,6 +5145,9 @@
     <w:pPr>
       <w:spacing w:after="0" w:line="240" w:lineRule="auto"/>
     </w:pPr>
+    <w:rPr>
+      <w:color w:val="000000"/>
+    </w:rPr>
     <w:tblPr>
       <w:tblStyleRowBandSize w:val="1"/>
       <w:tblStyleColBandSize w:val="1"/>
@@ -4801,6 +5254,9 @@
     <w:pPr>
       <w:spacing w:after="0" w:line="240" w:lineRule="auto"/>
     </w:pPr>
+    <w:rPr>
+      <w:color w:val="000000"/>
+    </w:rPr>
     <w:tblPr>
       <w:tblStyleRowBandSize w:val="1"/>
       <w:tblStyleColBandSize w:val="1"/>
@@ -4907,6 +5363,9 @@
     <w:pPr>
       <w:spacing w:after="0" w:line="240" w:lineRule="auto"/>
     </w:pPr>
+    <w:rPr>
+      <w:color w:val="000000"/>
+    </w:rPr>
     <w:tblPr>
       <w:tblStyleRowBandSize w:val="1"/>
       <w:tblStyleColBandSize w:val="1"/>
@@ -5013,6 +5472,9 @@
     <w:pPr>
       <w:spacing w:after="0" w:line="240" w:lineRule="auto"/>
     </w:pPr>
+    <w:rPr>
+      <w:color w:val="000000"/>
+    </w:rPr>
     <w:tblPr>
       <w:tblStyleRowBandSize w:val="1"/>
       <w:tblStyleColBandSize w:val="1"/>
@@ -5119,6 +5581,9 @@
     <w:pPr>
       <w:spacing w:after="0" w:line="240" w:lineRule="auto"/>
     </w:pPr>
+    <w:rPr>
+      <w:color w:val="000000"/>
+    </w:rPr>
     <w:tblPr>
       <w:tblStyleRowBandSize w:val="1"/>
       <w:tblStyleColBandSize w:val="1"/>
@@ -5225,6 +5690,9 @@
     <w:pPr>
       <w:spacing w:after="0" w:line="240" w:lineRule="auto"/>
     </w:pPr>
+    <w:rPr>
+      <w:color w:val="000000"/>
+    </w:rPr>
     <w:tblPr>
       <w:tblStyleRowBandSize w:val="1"/>
       <w:tblStyleColBandSize w:val="1"/>
@@ -5331,6 +5799,9 @@
     <w:pPr>
       <w:spacing w:after="0" w:line="240" w:lineRule="auto"/>
     </w:pPr>
+    <w:rPr>
+      <w:color w:val="000000"/>
+    </w:rPr>
     <w:tblPr>
       <w:tblStyleRowBandSize w:val="1"/>
       <w:tblStyleColBandSize w:val="1"/>
@@ -5437,6 +5908,9 @@
     <w:pPr>
       <w:spacing w:after="0" w:line="240" w:lineRule="auto"/>
     </w:pPr>
+    <w:rPr>
+      <w:color w:val="000000"/>
+    </w:rPr>
     <w:tblPr>
       <w:tblStyleRowBandSize w:val="1"/>
       <w:tblStyleColBandSize w:val="1"/>
@@ -5586,6 +6060,9 @@
     <w:pPr>
       <w:spacing w:after="0" w:line="240" w:lineRule="auto"/>
     </w:pPr>
+    <w:rPr>
+      <w:color w:val="000000"/>
+    </w:rPr>
     <w:tblPr>
       <w:tblStyleRowBandSize w:val="1"/>
       <w:tblStyleColBandSize w:val="1"/>
@@ -5735,6 +6212,9 @@
     <w:pPr>
       <w:spacing w:after="0" w:line="240" w:lineRule="auto"/>
     </w:pPr>
+    <w:rPr>
+      <w:color w:val="000000"/>
+    </w:rPr>
     <w:tblPr>
       <w:tblStyleRowBandSize w:val="1"/>
       <w:tblStyleColBandSize w:val="1"/>
@@ -5884,6 +6364,9 @@
     <w:pPr>
       <w:spacing w:after="0" w:line="240" w:lineRule="auto"/>
     </w:pPr>
+    <w:rPr>
+      <w:color w:val="000000"/>
+    </w:rPr>
     <w:tblPr>
       <w:tblStyleRowBandSize w:val="1"/>
       <w:tblStyleColBandSize w:val="1"/>
@@ -6033,6 +6516,9 @@
     <w:pPr>
       <w:spacing w:after="0" w:line="240" w:lineRule="auto"/>
     </w:pPr>
+    <w:rPr>
+      <w:color w:val="000000"/>
+    </w:rPr>
     <w:tblPr>
       <w:tblStyleRowBandSize w:val="1"/>
       <w:tblStyleColBandSize w:val="1"/>
@@ -6182,6 +6668,9 @@
     <w:pPr>
       <w:spacing w:after="0" w:line="240" w:lineRule="auto"/>
     </w:pPr>
+    <w:rPr>
+      <w:color w:val="000000"/>
+    </w:rPr>
     <w:tblPr>
       <w:tblStyleRowBandSize w:val="1"/>
       <w:tblStyleColBandSize w:val="1"/>
@@ -6331,6 +6820,9 @@
     <w:pPr>
       <w:spacing w:after="0" w:line="240" w:lineRule="auto"/>
     </w:pPr>
+    <w:rPr>
+      <w:color w:val="000000"/>
+    </w:rPr>
     <w:tblPr>
       <w:tblStyleRowBandSize w:val="1"/>
       <w:tblStyleColBandSize w:val="1"/>
@@ -6481,7 +6973,7 @@
       <w:spacing w:after="0" w:line="240" w:lineRule="auto"/>
     </w:pPr>
     <w:rPr>
-      <w:color w:val="000000" w:themeColor="text1"/>
+      <w:color w:val="000000"/>
     </w:rPr>
     <w:tblPr>
       <w:tblStyleRowBandSize w:val="1"/>
@@ -6565,7 +7057,7 @@
       <w:spacing w:after="0" w:line="240" w:lineRule="auto"/>
     </w:pPr>
     <w:rPr>
-      <w:color w:val="000000" w:themeColor="text1"/>
+      <w:color w:val="000000"/>
     </w:rPr>
     <w:tblPr>
       <w:tblStyleRowBandSize w:val="1"/>
@@ -6649,7 +7141,7 @@
       <w:spacing w:after="0" w:line="240" w:lineRule="auto"/>
     </w:pPr>
     <w:rPr>
-      <w:color w:val="000000" w:themeColor="text1"/>
+      <w:color w:val="000000"/>
     </w:rPr>
     <w:tblPr>
       <w:tblStyleRowBandSize w:val="1"/>
@@ -6733,7 +7225,7 @@
       <w:spacing w:after="0" w:line="240" w:lineRule="auto"/>
     </w:pPr>
     <w:rPr>
-      <w:color w:val="000000" w:themeColor="text1"/>
+      <w:color w:val="000000"/>
     </w:rPr>
     <w:tblPr>
       <w:tblStyleRowBandSize w:val="1"/>
@@ -6817,7 +7309,7 @@
       <w:spacing w:after="0" w:line="240" w:lineRule="auto"/>
     </w:pPr>
     <w:rPr>
-      <w:color w:val="000000" w:themeColor="text1"/>
+      <w:color w:val="000000"/>
     </w:rPr>
     <w:tblPr>
       <w:tblStyleRowBandSize w:val="1"/>
@@ -6901,7 +7393,7 @@
       <w:spacing w:after="0" w:line="240" w:lineRule="auto"/>
     </w:pPr>
     <w:rPr>
-      <w:color w:val="000000" w:themeColor="text1"/>
+      <w:color w:val="000000"/>
     </w:rPr>
     <w:tblPr>
       <w:tblStyleRowBandSize w:val="1"/>
@@ -6985,7 +7477,7 @@
       <w:spacing w:after="0" w:line="240" w:lineRule="auto"/>
     </w:pPr>
     <w:rPr>
-      <w:color w:val="000000" w:themeColor="text1"/>
+      <w:color w:val="000000"/>
     </w:rPr>
     <w:tblPr>
       <w:tblStyleRowBandSize w:val="1"/>
@@ -7070,7 +7562,7 @@
     </w:pPr>
     <w:rPr>
       <w:rFonts w:asciiTheme="majorHAnsi" w:eastAsiaTheme="majorEastAsia" w:hAnsiTheme="majorHAnsi" w:cstheme="majorBidi"/>
-      <w:color w:val="000000" w:themeColor="text1"/>
+      <w:color w:val="000000"/>
     </w:rPr>
     <w:tblPr>
       <w:tblStyleRowBandSize w:val="1"/>
@@ -7198,7 +7690,7 @@
     </w:pPr>
     <w:rPr>
       <w:rFonts w:asciiTheme="majorHAnsi" w:eastAsiaTheme="majorEastAsia" w:hAnsiTheme="majorHAnsi" w:cstheme="majorBidi"/>
-      <w:color w:val="000000" w:themeColor="text1"/>
+      <w:color w:val="000000"/>
     </w:rPr>
     <w:tblPr>
       <w:tblStyleRowBandSize w:val="1"/>
@@ -7326,7 +7818,7 @@
     </w:pPr>
     <w:rPr>
       <w:rFonts w:asciiTheme="majorHAnsi" w:eastAsiaTheme="majorEastAsia" w:hAnsiTheme="majorHAnsi" w:cstheme="majorBidi"/>
-      <w:color w:val="000000" w:themeColor="text1"/>
+      <w:color w:val="000000"/>
     </w:rPr>
     <w:tblPr>
       <w:tblStyleRowBandSize w:val="1"/>
@@ -7454,7 +7946,7 @@
     </w:pPr>
     <w:rPr>
       <w:rFonts w:asciiTheme="majorHAnsi" w:eastAsiaTheme="majorEastAsia" w:hAnsiTheme="majorHAnsi" w:cstheme="majorBidi"/>
-      <w:color w:val="000000" w:themeColor="text1"/>
+      <w:color w:val="000000"/>
     </w:rPr>
     <w:tblPr>
       <w:tblStyleRowBandSize w:val="1"/>
@@ -7582,7 +8074,7 @@
     </w:pPr>
     <w:rPr>
       <w:rFonts w:asciiTheme="majorHAnsi" w:eastAsiaTheme="majorEastAsia" w:hAnsiTheme="majorHAnsi" w:cstheme="majorBidi"/>
-      <w:color w:val="000000" w:themeColor="text1"/>
+      <w:color w:val="000000"/>
     </w:rPr>
     <w:tblPr>
       <w:tblStyleRowBandSize w:val="1"/>
@@ -7710,7 +8202,7 @@
     </w:pPr>
     <w:rPr>
       <w:rFonts w:asciiTheme="majorHAnsi" w:eastAsiaTheme="majorEastAsia" w:hAnsiTheme="majorHAnsi" w:cstheme="majorBidi"/>
-      <w:color w:val="000000" w:themeColor="text1"/>
+      <w:color w:val="000000"/>
     </w:rPr>
     <w:tblPr>
       <w:tblStyleRowBandSize w:val="1"/>
@@ -7838,7 +8330,7 @@
     </w:pPr>
     <w:rPr>
       <w:rFonts w:asciiTheme="majorHAnsi" w:eastAsiaTheme="majorEastAsia" w:hAnsiTheme="majorHAnsi" w:cstheme="majorBidi"/>
-      <w:color w:val="000000" w:themeColor="text1"/>
+      <w:color w:val="000000"/>
     </w:rPr>
     <w:tblPr>
       <w:tblStyleRowBandSize w:val="1"/>
@@ -7964,6 +8456,9 @@
     <w:pPr>
       <w:spacing w:after="0" w:line="240" w:lineRule="auto"/>
     </w:pPr>
+    <w:rPr>
+      <w:color w:val="000000"/>
+    </w:rPr>
     <w:tblPr>
       <w:tblStyleRowBandSize w:val="1"/>
       <w:tblStyleColBandSize w:val="1"/>
@@ -8037,6 +8532,9 @@
     <w:pPr>
       <w:spacing w:after="0" w:line="240" w:lineRule="auto"/>
     </w:pPr>
+    <w:rPr>
+      <w:color w:val="000000"/>
+    </w:rPr>
     <w:tblPr>
       <w:tblStyleRowBandSize w:val="1"/>
       <w:tblStyleColBandSize w:val="1"/>
@@ -8110,6 +8608,9 @@
     <w:pPr>
       <w:spacing w:after="0" w:line="240" w:lineRule="auto"/>
     </w:pPr>
+    <w:rPr>
+      <w:color w:val="000000"/>
+    </w:rPr>
     <w:tblPr>
       <w:tblStyleRowBandSize w:val="1"/>
       <w:tblStyleColBandSize w:val="1"/>
@@ -8183,6 +8684,9 @@
     <w:pPr>
       <w:spacing w:after="0" w:line="240" w:lineRule="auto"/>
     </w:pPr>
+    <w:rPr>
+      <w:color w:val="000000"/>
+    </w:rPr>
     <w:tblPr>
       <w:tblStyleRowBandSize w:val="1"/>
       <w:tblStyleColBandSize w:val="1"/>
@@ -8256,6 +8760,9 @@
     <w:pPr>
       <w:spacing w:after="0" w:line="240" w:lineRule="auto"/>
     </w:pPr>
+    <w:rPr>
+      <w:color w:val="000000"/>
+    </w:rPr>
     <w:tblPr>
       <w:tblStyleRowBandSize w:val="1"/>
       <w:tblStyleColBandSize w:val="1"/>
@@ -8329,6 +8836,9 @@
     <w:pPr>
       <w:spacing w:after="0" w:line="240" w:lineRule="auto"/>
     </w:pPr>
+    <w:rPr>
+      <w:color w:val="000000"/>
+    </w:rPr>
     <w:tblPr>
       <w:tblStyleRowBandSize w:val="1"/>
       <w:tblStyleColBandSize w:val="1"/>
@@ -8402,6 +8912,9 @@
     <w:pPr>
       <w:spacing w:after="0" w:line="240" w:lineRule="auto"/>
     </w:pPr>
+    <w:rPr>
+      <w:color w:val="000000"/>
+    </w:rPr>
     <w:tblPr>
       <w:tblStyleRowBandSize w:val="1"/>
       <w:tblStyleColBandSize w:val="1"/>
@@ -8477,7 +8990,7 @@
     </w:pPr>
     <w:rPr>
       <w:rFonts w:asciiTheme="majorHAnsi" w:eastAsiaTheme="majorEastAsia" w:hAnsiTheme="majorHAnsi" w:cstheme="majorBidi"/>
-      <w:color w:val="000000" w:themeColor="text1"/>
+      <w:color w:val="000000"/>
     </w:rPr>
     <w:tblPr>
       <w:tblStyleRowBandSize w:val="1"/>
@@ -8602,7 +9115,7 @@
     </w:pPr>
     <w:rPr>
       <w:rFonts w:asciiTheme="majorHAnsi" w:eastAsiaTheme="majorEastAsia" w:hAnsiTheme="majorHAnsi" w:cstheme="majorBidi"/>
-      <w:color w:val="000000" w:themeColor="text1"/>
+      <w:color w:val="000000"/>
     </w:rPr>
     <w:tblPr>
       <w:tblStyleRowBandSize w:val="1"/>
@@ -8727,7 +9240,7 @@
     </w:pPr>
     <w:rPr>
       <w:rFonts w:asciiTheme="majorHAnsi" w:eastAsiaTheme="majorEastAsia" w:hAnsiTheme="majorHAnsi" w:cstheme="majorBidi"/>
-      <w:color w:val="000000" w:themeColor="text1"/>
+      <w:color w:val="000000"/>
     </w:rPr>
     <w:tblPr>
       <w:tblStyleRowBandSize w:val="1"/>
@@ -8852,7 +9365,7 @@
     </w:pPr>
     <w:rPr>
       <w:rFonts w:asciiTheme="majorHAnsi" w:eastAsiaTheme="majorEastAsia" w:hAnsiTheme="majorHAnsi" w:cstheme="majorBidi"/>
-      <w:color w:val="000000" w:themeColor="text1"/>
+      <w:color w:val="000000"/>
     </w:rPr>
     <w:tblPr>
       <w:tblStyleRowBandSize w:val="1"/>
@@ -8977,7 +9490,7 @@
     </w:pPr>
     <w:rPr>
       <w:rFonts w:asciiTheme="majorHAnsi" w:eastAsiaTheme="majorEastAsia" w:hAnsiTheme="majorHAnsi" w:cstheme="majorBidi"/>
-      <w:color w:val="000000" w:themeColor="text1"/>
+      <w:color w:val="000000"/>
     </w:rPr>
     <w:tblPr>
       <w:tblStyleRowBandSize w:val="1"/>
@@ -9102,7 +9615,7 @@
     </w:pPr>
     <w:rPr>
       <w:rFonts w:asciiTheme="majorHAnsi" w:eastAsiaTheme="majorEastAsia" w:hAnsiTheme="majorHAnsi" w:cstheme="majorBidi"/>
-      <w:color w:val="000000" w:themeColor="text1"/>
+      <w:color w:val="000000"/>
     </w:rPr>
     <w:tblPr>
       <w:tblStyleRowBandSize w:val="1"/>
@@ -9227,7 +9740,7 @@
     </w:pPr>
     <w:rPr>
       <w:rFonts w:asciiTheme="majorHAnsi" w:eastAsiaTheme="majorEastAsia" w:hAnsiTheme="majorHAnsi" w:cstheme="majorBidi"/>
-      <w:color w:val="000000" w:themeColor="text1"/>
+      <w:color w:val="000000"/>
     </w:rPr>
     <w:tblPr>
       <w:tblStyleRowBandSize w:val="1"/>
@@ -9350,6 +9863,9 @@
     <w:pPr>
       <w:spacing w:after="0" w:line="240" w:lineRule="auto"/>
     </w:pPr>
+    <w:rPr>
+      <w:color w:val="000000"/>
+    </w:rPr>
     <w:tblPr>
       <w:tblStyleRowBandSize w:val="1"/>
       <w:tblStyleColBandSize w:val="1"/>
@@ -9491,6 +10007,9 @@
     <w:pPr>
       <w:spacing w:after="0" w:line="240" w:lineRule="auto"/>
     </w:pPr>
+    <w:rPr>
+      <w:color w:val="000000"/>
+    </w:rPr>
     <w:tblPr>
       <w:tblStyleRowBandSize w:val="1"/>
       <w:tblStyleColBandSize w:val="1"/>
@@ -9632,6 +10151,9 @@
     <w:pPr>
       <w:spacing w:after="0" w:line="240" w:lineRule="auto"/>
     </w:pPr>
+    <w:rPr>
+      <w:color w:val="000000"/>
+    </w:rPr>
     <w:tblPr>
       <w:tblStyleRowBandSize w:val="1"/>
       <w:tblStyleColBandSize w:val="1"/>
@@ -9773,6 +10295,9 @@
     <w:pPr>
       <w:spacing w:after="0" w:line="240" w:lineRule="auto"/>
     </w:pPr>
+    <w:rPr>
+      <w:color w:val="000000"/>
+    </w:rPr>
     <w:tblPr>
       <w:tblStyleRowBandSize w:val="1"/>
       <w:tblStyleColBandSize w:val="1"/>
@@ -9914,6 +10439,9 @@
     <w:pPr>
       <w:spacing w:after="0" w:line="240" w:lineRule="auto"/>
     </w:pPr>
+    <w:rPr>
+      <w:color w:val="000000"/>
+    </w:rPr>
     <w:tblPr>
       <w:tblStyleRowBandSize w:val="1"/>
       <w:tblStyleColBandSize w:val="1"/>
@@ -10055,6 +10583,9 @@
     <w:pPr>
       <w:spacing w:after="0" w:line="240" w:lineRule="auto"/>
     </w:pPr>
+    <w:rPr>
+      <w:color w:val="000000"/>
+    </w:rPr>
     <w:tblPr>
       <w:tblStyleRowBandSize w:val="1"/>
       <w:tblStyleColBandSize w:val="1"/>
@@ -10196,6 +10727,9 @@
     <w:pPr>
       <w:spacing w:after="0" w:line="240" w:lineRule="auto"/>
     </w:pPr>
+    <w:rPr>
+      <w:color w:val="000000"/>
+    </w:rPr>
     <w:tblPr>
       <w:tblStyleRowBandSize w:val="1"/>
       <w:tblStyleColBandSize w:val="1"/>
@@ -10338,7 +10872,7 @@
       <w:spacing w:after="0" w:line="240" w:lineRule="auto"/>
     </w:pPr>
     <w:rPr>
-      <w:color w:val="FFFFFF" w:themeColor="background1"/>
+      <w:color w:val="000000"/>
     </w:rPr>
     <w:tblPr>
       <w:tblStyleRowBandSize w:val="1"/>
@@ -10452,7 +10986,7 @@
       <w:spacing w:after="0" w:line="240" w:lineRule="auto"/>
     </w:pPr>
     <w:rPr>
-      <w:color w:val="FFFFFF" w:themeColor="background1"/>
+      <w:color w:val="000000"/>
     </w:rPr>
     <w:tblPr>
       <w:tblStyleRowBandSize w:val="1"/>
@@ -10566,7 +11100,7 @@
       <w:spacing w:after="0" w:line="240" w:lineRule="auto"/>
     </w:pPr>
     <w:rPr>
-      <w:color w:val="FFFFFF" w:themeColor="background1"/>
+      <w:color w:val="000000"/>
     </w:rPr>
     <w:tblPr>
       <w:tblStyleRowBandSize w:val="1"/>
@@ -10680,7 +11214,7 @@
       <w:spacing w:after="0" w:line="240" w:lineRule="auto"/>
     </w:pPr>
     <w:rPr>
-      <w:color w:val="FFFFFF" w:themeColor="background1"/>
+      <w:color w:val="000000"/>
     </w:rPr>
     <w:tblPr>
       <w:tblStyleRowBandSize w:val="1"/>
@@ -10794,7 +11328,7 @@
       <w:spacing w:after="0" w:line="240" w:lineRule="auto"/>
     </w:pPr>
     <w:rPr>
-      <w:color w:val="FFFFFF" w:themeColor="background1"/>
+      <w:color w:val="000000"/>
     </w:rPr>
     <w:tblPr>
       <w:tblStyleRowBandSize w:val="1"/>
@@ -10908,7 +11442,7 @@
       <w:spacing w:after="0" w:line="240" w:lineRule="auto"/>
     </w:pPr>
     <w:rPr>
-      <w:color w:val="FFFFFF" w:themeColor="background1"/>
+      <w:color w:val="000000"/>
     </w:rPr>
     <w:tblPr>
       <w:tblStyleRowBandSize w:val="1"/>
@@ -11022,7 +11556,7 @@
       <w:spacing w:after="0" w:line="240" w:lineRule="auto"/>
     </w:pPr>
     <w:rPr>
-      <w:color w:val="FFFFFF" w:themeColor="background1"/>
+      <w:color w:val="000000"/>
     </w:rPr>
     <w:tblPr>
       <w:tblStyleRowBandSize w:val="1"/>
@@ -11136,7 +11670,7 @@
       <w:spacing w:after="0" w:line="240" w:lineRule="auto"/>
     </w:pPr>
     <w:rPr>
-      <w:color w:val="000000" w:themeColor="text1"/>
+      <w:color w:val="000000"/>
     </w:rPr>
     <w:tblPr>
       <w:tblStyleRowBandSize w:val="1"/>
@@ -11258,7 +11792,7 @@
       <w:spacing w:after="0" w:line="240" w:lineRule="auto"/>
     </w:pPr>
     <w:rPr>
-      <w:color w:val="000000" w:themeColor="text1"/>
+      <w:color w:val="000000"/>
     </w:rPr>
     <w:tblPr>
       <w:tblStyleRowBandSize w:val="1"/>
@@ -11380,7 +11914,7 @@
       <w:spacing w:after="0" w:line="240" w:lineRule="auto"/>
     </w:pPr>
     <w:rPr>
-      <w:color w:val="000000" w:themeColor="text1"/>
+      <w:color w:val="000000"/>
     </w:rPr>
     <w:tblPr>
       <w:tblStyleRowBandSize w:val="1"/>
@@ -11502,7 +12036,7 @@
       <w:spacing w:after="0" w:line="240" w:lineRule="auto"/>
     </w:pPr>
     <w:rPr>
-      <w:color w:val="000000" w:themeColor="text1"/>
+      <w:color w:val="000000"/>
     </w:rPr>
     <w:tblPr>
       <w:tblStyleRowBandSize w:val="1"/>
@@ -11614,7 +12148,7 @@
       <w:spacing w:after="0" w:line="240" w:lineRule="auto"/>
     </w:pPr>
     <w:rPr>
-      <w:color w:val="000000" w:themeColor="text1"/>
+      <w:color w:val="000000"/>
     </w:rPr>
     <w:tblPr>
       <w:tblStyleRowBandSize w:val="1"/>
@@ -11736,7 +12270,7 @@
       <w:spacing w:after="0" w:line="240" w:lineRule="auto"/>
     </w:pPr>
     <w:rPr>
-      <w:color w:val="000000" w:themeColor="text1"/>
+      <w:color w:val="000000"/>
     </w:rPr>
     <w:tblPr>
       <w:tblStyleRowBandSize w:val="1"/>
@@ -11858,7 +12392,7 @@
       <w:spacing w:after="0" w:line="240" w:lineRule="auto"/>
     </w:pPr>
     <w:rPr>
-      <w:color w:val="000000" w:themeColor="text1"/>
+      <w:color w:val="000000"/>
     </w:rPr>
     <w:tblPr>
       <w:tblStyleRowBandSize w:val="1"/>
@@ -11980,7 +12514,7 @@
       <w:spacing w:after="0" w:line="240" w:lineRule="auto"/>
     </w:pPr>
     <w:rPr>
-      <w:color w:val="000000" w:themeColor="text1"/>
+      <w:color w:val="000000"/>
     </w:rPr>
     <w:tblPr>
       <w:tblStyleRowBandSize w:val="1"/>
@@ -12066,7 +12600,7 @@
       <w:spacing w:after="0" w:line="240" w:lineRule="auto"/>
     </w:pPr>
     <w:rPr>
-      <w:color w:val="000000" w:themeColor="text1"/>
+      <w:color w:val="000000"/>
     </w:rPr>
     <w:tblPr>
       <w:tblStyleRowBandSize w:val="1"/>
@@ -12152,7 +12686,7 @@
       <w:spacing w:after="0" w:line="240" w:lineRule="auto"/>
     </w:pPr>
     <w:rPr>
-      <w:color w:val="000000" w:themeColor="text1"/>
+      <w:color w:val="000000"/>
     </w:rPr>
     <w:tblPr>
       <w:tblStyleRowBandSize w:val="1"/>
@@ -12238,7 +12772,7 @@
       <w:spacing w:after="0" w:line="240" w:lineRule="auto"/>
     </w:pPr>
     <w:rPr>
-      <w:color w:val="000000" w:themeColor="text1"/>
+      <w:color w:val="000000"/>
     </w:rPr>
     <w:tblPr>
       <w:tblStyleRowBandSize w:val="1"/>
@@ -12324,7 +12858,7 @@
       <w:spacing w:after="0" w:line="240" w:lineRule="auto"/>
     </w:pPr>
     <w:rPr>
-      <w:color w:val="000000" w:themeColor="text1"/>
+      <w:color w:val="000000"/>
     </w:rPr>
     <w:tblPr>
       <w:tblStyleRowBandSize w:val="1"/>
@@ -12410,7 +12944,7 @@
       <w:spacing w:after="0" w:line="240" w:lineRule="auto"/>
     </w:pPr>
     <w:rPr>
-      <w:color w:val="000000" w:themeColor="text1"/>
+      <w:color w:val="000000"/>
     </w:rPr>
     <w:tblPr>
       <w:tblStyleRowBandSize w:val="1"/>
@@ -12496,7 +13030,7 @@
       <w:spacing w:after="0" w:line="240" w:lineRule="auto"/>
     </w:pPr>
     <w:rPr>
-      <w:color w:val="000000" w:themeColor="text1"/>
+      <w:color w:val="000000"/>
     </w:rPr>
     <w:tblPr>
       <w:tblStyleRowBandSize w:val="1"/>
@@ -12582,7 +13116,7 @@
       <w:spacing w:after="0" w:line="240" w:lineRule="auto"/>
     </w:pPr>
     <w:rPr>
-      <w:color w:val="000000" w:themeColor="text1"/>
+      <w:color w:val="000000"/>
     </w:rPr>
     <w:tblPr>
       <w:tblStyleRowBandSize w:val="1"/>
@@ -12662,7 +13196,7 @@
       <w:spacing w:after="0" w:line="240" w:lineRule="auto"/>
     </w:pPr>
     <w:rPr>
-      <w:color w:val="000000" w:themeColor="text1"/>
+      <w:color w:val="000000"/>
     </w:rPr>
     <w:tblPr>
       <w:tblStyleRowBandSize w:val="1"/>
@@ -12742,7 +13276,7 @@
       <w:spacing w:after="0" w:line="240" w:lineRule="auto"/>
     </w:pPr>
     <w:rPr>
-      <w:color w:val="000000" w:themeColor="text1"/>
+      <w:color w:val="000000"/>
     </w:rPr>
     <w:tblPr>
       <w:tblStyleRowBandSize w:val="1"/>
@@ -12822,7 +13356,7 @@
       <w:spacing w:after="0" w:line="240" w:lineRule="auto"/>
     </w:pPr>
     <w:rPr>
-      <w:color w:val="000000" w:themeColor="text1"/>
+      <w:color w:val="000000"/>
     </w:rPr>
     <w:tblPr>
       <w:tblStyleRowBandSize w:val="1"/>
@@ -12902,7 +13436,7 @@
       <w:spacing w:after="0" w:line="240" w:lineRule="auto"/>
     </w:pPr>
     <w:rPr>
-      <w:color w:val="000000" w:themeColor="text1"/>
+      <w:color w:val="000000"/>
     </w:rPr>
     <w:tblPr>
       <w:tblStyleRowBandSize w:val="1"/>
@@ -12982,7 +13516,7 @@
       <w:spacing w:after="0" w:line="240" w:lineRule="auto"/>
     </w:pPr>
     <w:rPr>
-      <w:color w:val="000000" w:themeColor="text1"/>
+      <w:color w:val="000000"/>
     </w:rPr>
     <w:tblPr>
       <w:tblStyleRowBandSize w:val="1"/>
@@ -13062,7 +13596,7 @@
       <w:spacing w:after="0" w:line="240" w:lineRule="auto"/>
     </w:pPr>
     <w:rPr>
-      <w:color w:val="000000" w:themeColor="text1"/>
+      <w:color w:val="000000"/>
     </w:rPr>
     <w:tblPr>
       <w:tblStyleRowBandSize w:val="1"/>

</xml_diff>